<commit_message>
Improve highlights text: technique name, transfer-function wording, 85-char compliance
</commit_message>
<xml_diff>
--- a/submission_measurement/highlights.docx
+++ b/submission_measurement/highlights.docx
@@ -20,7 +20,7 @@
         </w:numPr>
       </w:pPr>
       <w:r>
-        <w:t xml:space="preserve">A trapped ion becomes a quantitative, non-contact surface topography probe</w:t>
+        <w:t xml:space="preserve">Quantum electrostatic scanning probe microscopy: trapped-ion surface metrology</w:t>
       </w:r>
     </w:p>
     <w:p>
@@ -32,7 +32,7 @@
         </w:numPr>
       </w:pPr>
       <w:r>
-        <w:t xml:space="preserve">Instrument transfer function k</w:t>
+        <w:t xml:space="preserve">Transfer function k</w:t>
       </w:r>
       <w:r>
         <w:rPr>
@@ -41,7 +41,7 @@
         <w:t xml:space="preserve">2e</w:t>
       </w:r>
       <w:r>
-        <w:t xml:space="preserve">(-kh) sets an irreducible spatial limit</w:t>
+        <w:t xml:space="preserve">(-kh) sets an irreducible spatial-information limit</w:t>
       </w:r>
     </w:p>
     <w:p>
@@ -65,7 +65,7 @@
         </w:numPr>
       </w:pPr>
       <w:r>
-        <w:t xml:space="preserve">Quantum enhancement boosts precision but cannot restore lost spatial information</w:t>
+        <w:t xml:space="preserve">Quantum enhancement cannot restore spatial modes suppressed by the transfer function</w:t>
       </w:r>
     </w:p>
     <w:p>

</xml_diff>

<commit_message>
Submission readiness: highlights within 85 chars and aligned wording, cover letter date 1 October 2026
</commit_message>
<xml_diff>
--- a/submission_measurement/highlights.docx
+++ b/submission_measurement/highlights.docx
@@ -41,7 +41,7 @@
         <w:t xml:space="preserve">2e</w:t>
       </w:r>
       <w:r>
-        <w:t xml:space="preserve">(-kh) sets an irreducible spatial-information limit</w:t>
+        <w:t xml:space="preserve">(-kh) sets an effective spatial-information limit</w:t>
       </w:r>
     </w:p>
     <w:p>
@@ -65,7 +65,7 @@
         </w:numPr>
       </w:pPr>
       <w:r>
-        <w:t xml:space="preserve">Quantum enhancement cannot restore spatial modes suppressed by the transfer function</w:t>
+        <w:t xml:space="preserve">Quantum enhancement cannot restore modes suppressed by the transfer function</w:t>
       </w:r>
     </w:p>
     <w:p>

</xml_diff>